<commit_message>
Modify Pop-up tables & Training mode
</commit_message>
<xml_diff>
--- a/Assets/Docs/pharamacy system agreement paper.docx
+++ b/Assets/Docs/pharamacy system agreement paper.docx
@@ -288,7 +288,23 @@
           <w:sz w:val="24"/>
           <w:szCs w:val="24"/>
         </w:rPr>
-        <w:t>The Developer has developed a pharmacy desktop application ("Software") as per the Client's specified requirements. The Software has been reviewed and approved for deployment by the Client.</w:t>
+        <w:t xml:space="preserve">The Developer has developed a pharmacy desktop application ("Software") per the Client's specified requirements. The </w:t>
+      </w:r>
+      <w:r>
+        <w:rPr>
+          <w:rFonts w:ascii="Times New Roman" w:hAnsi="Times New Roman" w:cs="Times New Roman"/>
+          <w:sz w:val="24"/>
+          <w:szCs w:val="24"/>
+        </w:rPr>
+        <w:t>Client has reviewed and approved the software for deployment</w:t>
+      </w:r>
+      <w:r>
+        <w:rPr>
+          <w:rFonts w:ascii="Times New Roman" w:hAnsi="Times New Roman" w:cs="Times New Roman"/>
+          <w:sz w:val="24"/>
+          <w:szCs w:val="24"/>
+        </w:rPr>
+        <w:t>.</w:t>
       </w:r>
     </w:p>
     <w:p>
@@ -368,7 +384,7 @@
           <w:sz w:val="24"/>
           <w:szCs w:val="24"/>
         </w:rPr>
-        <w:t xml:space="preserve">The Client agrees to pay one-third (1/3) of the total cost upfront </w:t>
+        <w:t xml:space="preserve">The Client agrees to pay one-third (1/3) of the cost upfront </w:t>
       </w:r>
       <w:r>
         <w:rPr>
@@ -529,15 +545,6 @@
       <w:pPr>
         <w:rPr>
           <w:rFonts w:ascii="Times New Roman" w:hAnsi="Times New Roman" w:cs="Times New Roman"/>
-          <w:sz w:val="24"/>
-          <w:szCs w:val="24"/>
-        </w:rPr>
-      </w:pPr>
-    </w:p>
-    <w:p>
-      <w:pPr>
-        <w:rPr>
-          <w:rFonts w:ascii="Times New Roman" w:hAnsi="Times New Roman" w:cs="Times New Roman"/>
           <w:b/>
           <w:bCs/>
           <w:sz w:val="24"/>
@@ -768,7 +775,39 @@
           <w:sz w:val="24"/>
           <w:szCs w:val="24"/>
         </w:rPr>
-        <w:t>This Agreement shall be governed by and construed in accordance with the laws of [Your Country/State].</w:t>
+        <w:t xml:space="preserve">This Agreement shall be governed by and construed </w:t>
+      </w:r>
+      <w:r>
+        <w:rPr>
+          <w:rFonts w:ascii="Times New Roman" w:hAnsi="Times New Roman" w:cs="Times New Roman"/>
+          <w:sz w:val="24"/>
+          <w:szCs w:val="24"/>
+        </w:rPr>
+        <w:t>under</w:t>
+      </w:r>
+      <w:r>
+        <w:rPr>
+          <w:rFonts w:ascii="Times New Roman" w:hAnsi="Times New Roman" w:cs="Times New Roman"/>
+          <w:sz w:val="24"/>
+          <w:szCs w:val="24"/>
+        </w:rPr>
+        <w:t xml:space="preserve"> the laws of </w:t>
+      </w:r>
+      <w:r>
+        <w:rPr>
+          <w:rFonts w:ascii="Times New Roman" w:hAnsi="Times New Roman" w:cs="Times New Roman"/>
+          <w:sz w:val="24"/>
+          <w:szCs w:val="24"/>
+        </w:rPr>
+        <w:t>SRI LANKA</w:t>
+      </w:r>
+      <w:r>
+        <w:rPr>
+          <w:rFonts w:ascii="Times New Roman" w:hAnsi="Times New Roman" w:cs="Times New Roman"/>
+          <w:sz w:val="24"/>
+          <w:szCs w:val="24"/>
+        </w:rPr>
+        <w:t>.</w:t>
       </w:r>
     </w:p>
     <w:p>
@@ -839,6 +878,7 @@
     </w:p>
     <w:p>
       <w:pPr>
+        <w:spacing w:line="360" w:lineRule="auto"/>
         <w:rPr>
           <w:rFonts w:ascii="Times New Roman" w:hAnsi="Times New Roman" w:cs="Times New Roman"/>
           <w:sz w:val="24"/>
@@ -864,6 +904,7 @@
     </w:p>
     <w:p>
       <w:pPr>
+        <w:spacing w:line="360" w:lineRule="auto"/>
         <w:rPr>
           <w:rFonts w:ascii="Times New Roman" w:hAnsi="Times New Roman" w:cs="Times New Roman"/>
           <w:sz w:val="24"/>
@@ -889,6 +930,7 @@
     </w:p>
     <w:p>
       <w:pPr>
+        <w:spacing w:line="360" w:lineRule="auto"/>
         <w:rPr>
           <w:rFonts w:ascii="Times New Roman" w:hAnsi="Times New Roman" w:cs="Times New Roman"/>
           <w:sz w:val="24"/>
@@ -919,9 +961,18 @@
         </w:rPr>
         <w:t>_______</w:t>
       </w:r>
-    </w:p>
-    <w:p>
-      <w:pPr>
+      <w:r>
+        <w:rPr>
+          <w:rFonts w:ascii="Times New Roman" w:hAnsi="Times New Roman" w:cs="Times New Roman"/>
+          <w:sz w:val="24"/>
+          <w:szCs w:val="24"/>
+        </w:rPr>
+        <w:t>__</w:t>
+      </w:r>
+    </w:p>
+    <w:p>
+      <w:pPr>
+        <w:spacing w:line="360" w:lineRule="auto"/>
         <w:rPr>
           <w:rFonts w:ascii="Times New Roman" w:hAnsi="Times New Roman" w:cs="Times New Roman"/>
           <w:sz w:val="24"/>
@@ -939,6 +990,7 @@
     </w:p>
     <w:p>
       <w:pPr>
+        <w:spacing w:line="360" w:lineRule="auto"/>
         <w:rPr>
           <w:rFonts w:ascii="Times New Roman" w:hAnsi="Times New Roman" w:cs="Times New Roman"/>
           <w:sz w:val="24"/>
@@ -964,6 +1016,7 @@
     </w:p>
     <w:p>
       <w:pPr>
+        <w:spacing w:line="360" w:lineRule="auto"/>
         <w:rPr>
           <w:rFonts w:ascii="Times New Roman" w:hAnsi="Times New Roman" w:cs="Times New Roman"/>
           <w:sz w:val="24"/>
@@ -985,6 +1038,14 @@
           <w:szCs w:val="24"/>
         </w:rPr>
         <w:t>_______</w:t>
+      </w:r>
+      <w:r>
+        <w:rPr>
+          <w:rFonts w:ascii="Times New Roman" w:hAnsi="Times New Roman" w:cs="Times New Roman"/>
+          <w:sz w:val="24"/>
+          <w:szCs w:val="24"/>
+        </w:rPr>
+        <w:t>____</w:t>
       </w:r>
     </w:p>
     <w:sectPr>
@@ -1604,7 +1665,6 @@
   <w:style w:type="character" w:default="1" w:styleId="DefaultParagraphFont">
     <w:name w:val="Default Paragraph Font"/>
     <w:uiPriority w:val="1"/>
-    <w:semiHidden/>
     <w:unhideWhenUsed/>
   </w:style>
   <w:style w:type="table" w:default="1" w:styleId="TableNormal">

</xml_diff>

<commit_message>
Final Commitment before system initialization
</commit_message>
<xml_diff>
--- a/Assets/Docs/pharamacy system agreement paper.docx
+++ b/Assets/Docs/pharamacy system agreement paper.docx
@@ -14,16 +14,262 @@
       <w:r>
         <w:rPr>
           <w:rFonts w:ascii="Times New Roman" w:hAnsi="Times New Roman" w:cs="Times New Roman"/>
-          <w:sz w:val="24"/>
-          <w:szCs w:val="24"/>
+          <w:noProof/>
+          <w:sz w:val="24"/>
+          <w:szCs w:val="24"/>
+        </w:rPr>
+        <mc:AlternateContent>
+          <mc:Choice Requires="wps">
+            <w:drawing>
+              <wp:anchor distT="0" distB="0" distL="114300" distR="114300" simplePos="0" relativeHeight="251659264" behindDoc="1" locked="0" layoutInCell="1" allowOverlap="1" wp14:anchorId="07B876E7" wp14:editId="0E882E13">
+                <wp:simplePos x="0" y="0"/>
+                <wp:positionH relativeFrom="column">
+                  <wp:posOffset>0</wp:posOffset>
+                </wp:positionH>
+                <wp:positionV relativeFrom="paragraph">
+                  <wp:posOffset>495300</wp:posOffset>
+                </wp:positionV>
+                <wp:extent cx="6115050" cy="1352550"/>
+                <wp:effectExtent l="0" t="0" r="19050" b="19050"/>
+                <wp:wrapTopAndBottom/>
+                <wp:docPr id="1657373914" name="Rectangle 1"/>
+                <wp:cNvGraphicFramePr/>
+                <a:graphic xmlns:a="http://schemas.openxmlformats.org/drawingml/2006/main">
+                  <a:graphicData uri="http://schemas.microsoft.com/office/word/2010/wordprocessingShape">
+                    <wps:wsp>
+                      <wps:cNvSpPr/>
+                      <wps:spPr>
+                        <a:xfrm>
+                          <a:off x="0" y="0"/>
+                          <a:ext cx="6115050" cy="1352550"/>
+                        </a:xfrm>
+                        <a:prstGeom prst="rect">
+                          <a:avLst/>
+                        </a:prstGeom>
+                        <a:noFill/>
+                        <a:ln>
+                          <a:prstDash val="dash"/>
+                        </a:ln>
+                      </wps:spPr>
+                      <wps:style>
+                        <a:lnRef idx="2">
+                          <a:schemeClr val="accent1">
+                            <a:shade val="15000"/>
+                          </a:schemeClr>
+                        </a:lnRef>
+                        <a:fillRef idx="1">
+                          <a:schemeClr val="accent1"/>
+                        </a:fillRef>
+                        <a:effectRef idx="0">
+                          <a:schemeClr val="accent1"/>
+                        </a:effectRef>
+                        <a:fontRef idx="minor">
+                          <a:schemeClr val="lt1"/>
+                        </a:fontRef>
+                      </wps:style>
+                      <wps:txbx>
+                        <w:txbxContent>
+                          <w:p>
+                            <w:pPr>
+                              <w:spacing w:line="240" w:lineRule="auto"/>
+                              <w:rPr>
+                                <w:rFonts w:ascii="Times New Roman" w:hAnsi="Times New Roman" w:cs="Times New Roman"/>
+                                <w:color w:val="3B3838" w:themeColor="background2" w:themeShade="40"/>
+                                <w:sz w:val="24"/>
+                                <w:szCs w:val="24"/>
+                              </w:rPr>
+                            </w:pPr>
+                            <w:r>
+                              <w:rPr>
+                                <w:rFonts w:ascii="Times New Roman" w:hAnsi="Times New Roman" w:cs="Times New Roman"/>
+                                <w:color w:val="3B3838" w:themeColor="background2" w:themeShade="40"/>
+                                <w:sz w:val="24"/>
+                                <w:szCs w:val="24"/>
+                              </w:rPr>
+                              <w:t xml:space="preserve">Pharmacy management system v1.0.0  </w:t>
+                            </w:r>
+                          </w:p>
+                          <w:p>
+                            <w:pPr>
+                              <w:spacing w:line="240" w:lineRule="auto"/>
+                              <w:rPr>
+                                <w:rFonts w:ascii="Times New Roman" w:hAnsi="Times New Roman" w:cs="Times New Roman"/>
+                                <w:color w:val="3B3838" w:themeColor="background2" w:themeShade="40"/>
+                                <w:sz w:val="24"/>
+                                <w:szCs w:val="24"/>
+                              </w:rPr>
+                            </w:pPr>
+                            <w:r>
+                              <w:rPr>
+                                <w:rFonts w:ascii="Times New Roman" w:hAnsi="Times New Roman" w:cs="Times New Roman"/>
+                                <w:color w:val="3B3838" w:themeColor="background2" w:themeShade="40"/>
+                                <w:sz w:val="24"/>
+                                <w:szCs w:val="24"/>
+                              </w:rPr>
+                              <w:t xml:space="preserve">Developed by: Quantum Blaze Software Solution  </w:t>
+                            </w:r>
+                          </w:p>
+                          <w:p>
+                            <w:pPr>
+                              <w:spacing w:line="240" w:lineRule="auto"/>
+                              <w:rPr>
+                                <w:rFonts w:ascii="Times New Roman" w:hAnsi="Times New Roman" w:cs="Times New Roman"/>
+                                <w:color w:val="3B3838" w:themeColor="background2" w:themeShade="40"/>
+                                <w:sz w:val="24"/>
+                                <w:szCs w:val="24"/>
+                              </w:rPr>
+                            </w:pPr>
+                            <w:r>
+                              <w:rPr>
+                                <w:rFonts w:ascii="Times New Roman" w:hAnsi="Times New Roman" w:cs="Times New Roman"/>
+                                <w:color w:val="3B3838" w:themeColor="background2" w:themeShade="40"/>
+                                <w:sz w:val="24"/>
+                                <w:szCs w:val="24"/>
+                              </w:rPr>
+                              <w:t xml:space="preserve">System ID: QB-PHARM-2025-0002  </w:t>
+                            </w:r>
+                          </w:p>
+                          <w:p>
+                            <w:pPr>
+                              <w:spacing w:line="240" w:lineRule="auto"/>
+                              <w:rPr>
+                                <w:color w:val="3B3838" w:themeColor="background2" w:themeShade="40"/>
+                              </w:rPr>
+                            </w:pPr>
+                            <w:r>
+                              <w:rPr>
+                                <w:rFonts w:ascii="Times New Roman" w:hAnsi="Times New Roman" w:cs="Times New Roman"/>
+                                <w:color w:val="3B3838" w:themeColor="background2" w:themeShade="40"/>
+                                <w:sz w:val="24"/>
+                                <w:szCs w:val="24"/>
+                              </w:rPr>
+                              <w:t>License type: single business license</w:t>
+                            </w:r>
+                          </w:p>
+                        </w:txbxContent>
+                      </wps:txbx>
+                      <wps:bodyPr rot="0" spcFirstLastPara="0" vertOverflow="overflow" horzOverflow="overflow" vert="horz" wrap="square" lIns="91440" tIns="45720" rIns="91440" bIns="45720" numCol="1" spcCol="0" rtlCol="0" fromWordArt="0" anchor="ctr" anchorCtr="0" forceAA="0" compatLnSpc="1">
+                        <a:prstTxWarp prst="textNoShape">
+                          <a:avLst/>
+                        </a:prstTxWarp>
+                        <a:noAutofit/>
+                      </wps:bodyPr>
+                    </wps:wsp>
+                  </a:graphicData>
+                </a:graphic>
+                <wp14:sizeRelH relativeFrom="margin">
+                  <wp14:pctWidth>0</wp14:pctWidth>
+                </wp14:sizeRelH>
+                <wp14:sizeRelV relativeFrom="margin">
+                  <wp14:pctHeight>0</wp14:pctHeight>
+                </wp14:sizeRelV>
+              </wp:anchor>
+            </w:drawing>
+          </mc:Choice>
+          <mc:Fallback>
+            <w:pict>
+              <v:rect w14:anchorId="07B876E7" id="Rectangle 1" o:spid="_x0000_s1026" style="position:absolute;left:0;text-align:left;margin-left:0;margin-top:39pt;width:481.5pt;height:106.5pt;z-index:-251657216;visibility:visible;mso-wrap-style:square;mso-width-percent:0;mso-height-percent:0;mso-wrap-distance-left:9pt;mso-wrap-distance-top:0;mso-wrap-distance-right:9pt;mso-wrap-distance-bottom:0;mso-position-horizontal:absolute;mso-position-horizontal-relative:text;mso-position-vertical:absolute;mso-position-vertical-relative:text;mso-width-percent:0;mso-height-percent:0;mso-width-relative:margin;mso-height-relative:margin;v-text-anchor:middle" o:gfxdata="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" filled="f" strokecolor="#09101d [484]" strokeweight="1pt">
+                <v:stroke dashstyle="dash"/>
+                <v:textbox>
+                  <w:txbxContent>
+                    <w:p>
+                      <w:pPr>
+                        <w:spacing w:line="240" w:lineRule="auto"/>
+                        <w:rPr>
+                          <w:rFonts w:ascii="Times New Roman" w:hAnsi="Times New Roman" w:cs="Times New Roman"/>
+                          <w:color w:val="3B3838" w:themeColor="background2" w:themeShade="40"/>
+                          <w:sz w:val="24"/>
+                          <w:szCs w:val="24"/>
+                        </w:rPr>
+                      </w:pPr>
+                      <w:r>
+                        <w:rPr>
+                          <w:rFonts w:ascii="Times New Roman" w:hAnsi="Times New Roman" w:cs="Times New Roman"/>
+                          <w:color w:val="3B3838" w:themeColor="background2" w:themeShade="40"/>
+                          <w:sz w:val="24"/>
+                          <w:szCs w:val="24"/>
+                        </w:rPr>
+                        <w:t xml:space="preserve">Pharmacy management system v1.0.0  </w:t>
+                      </w:r>
+                    </w:p>
+                    <w:p>
+                      <w:pPr>
+                        <w:spacing w:line="240" w:lineRule="auto"/>
+                        <w:rPr>
+                          <w:rFonts w:ascii="Times New Roman" w:hAnsi="Times New Roman" w:cs="Times New Roman"/>
+                          <w:color w:val="3B3838" w:themeColor="background2" w:themeShade="40"/>
+                          <w:sz w:val="24"/>
+                          <w:szCs w:val="24"/>
+                        </w:rPr>
+                      </w:pPr>
+                      <w:r>
+                        <w:rPr>
+                          <w:rFonts w:ascii="Times New Roman" w:hAnsi="Times New Roman" w:cs="Times New Roman"/>
+                          <w:color w:val="3B3838" w:themeColor="background2" w:themeShade="40"/>
+                          <w:sz w:val="24"/>
+                          <w:szCs w:val="24"/>
+                        </w:rPr>
+                        <w:t xml:space="preserve">Developed by: Quantum Blaze Software Solution  </w:t>
+                      </w:r>
+                    </w:p>
+                    <w:p>
+                      <w:pPr>
+                        <w:spacing w:line="240" w:lineRule="auto"/>
+                        <w:rPr>
+                          <w:rFonts w:ascii="Times New Roman" w:hAnsi="Times New Roman" w:cs="Times New Roman"/>
+                          <w:color w:val="3B3838" w:themeColor="background2" w:themeShade="40"/>
+                          <w:sz w:val="24"/>
+                          <w:szCs w:val="24"/>
+                        </w:rPr>
+                      </w:pPr>
+                      <w:r>
+                        <w:rPr>
+                          <w:rFonts w:ascii="Times New Roman" w:hAnsi="Times New Roman" w:cs="Times New Roman"/>
+                          <w:color w:val="3B3838" w:themeColor="background2" w:themeShade="40"/>
+                          <w:sz w:val="24"/>
+                          <w:szCs w:val="24"/>
+                        </w:rPr>
+                        <w:t xml:space="preserve">System ID: QB-PHARM-2025-0002  </w:t>
+                      </w:r>
+                    </w:p>
+                    <w:p>
+                      <w:pPr>
+                        <w:spacing w:line="240" w:lineRule="auto"/>
+                        <w:rPr>
+                          <w:color w:val="3B3838" w:themeColor="background2" w:themeShade="40"/>
+                        </w:rPr>
+                      </w:pPr>
+                      <w:r>
+                        <w:rPr>
+                          <w:rFonts w:ascii="Times New Roman" w:hAnsi="Times New Roman" w:cs="Times New Roman"/>
+                          <w:color w:val="3B3838" w:themeColor="background2" w:themeShade="40"/>
+                          <w:sz w:val="24"/>
+                          <w:szCs w:val="24"/>
+                        </w:rPr>
+                        <w:t>License type: single business license</w:t>
+                      </w:r>
+                    </w:p>
+                  </w:txbxContent>
+                </v:textbox>
+                <w10:wrap type="topAndBottom"/>
+              </v:rect>
+            </w:pict>
+          </mc:Fallback>
+        </mc:AlternateContent>
+      </w:r>
+      <w:r>
+        <w:rPr>
+          <w:rFonts w:ascii="Times New Roman" w:hAnsi="Times New Roman" w:cs="Times New Roman"/>
+          <w:sz w:val="28"/>
+          <w:szCs w:val="28"/>
         </w:rPr>
         <w:t>PHARMACY SYSTEM</w:t>
       </w:r>
       <w:r>
         <w:rPr>
           <w:rFonts w:ascii="Times New Roman" w:hAnsi="Times New Roman" w:cs="Times New Roman"/>
-          <w:sz w:val="24"/>
-          <w:szCs w:val="24"/>
+          <w:sz w:val="28"/>
+          <w:szCs w:val="28"/>
         </w:rPr>
         <w:t xml:space="preserve"> AGREEMENT</w:t>
       </w:r>
@@ -59,7 +305,7 @@
           <w:sz w:val="24"/>
           <w:szCs w:val="24"/>
         </w:rPr>
-        <w:t>14</w:t>
+        <w:t>22</w:t>
       </w:r>
       <w:r>
         <w:rPr>
@@ -101,15 +347,6 @@
         </w:rPr>
         <w:t>, by and between:</w:t>
       </w:r>
-    </w:p>
-    <w:p>
-      <w:pPr>
-        <w:rPr>
-          <w:rFonts w:ascii="Times New Roman" w:hAnsi="Times New Roman" w:cs="Times New Roman"/>
-          <w:sz w:val="24"/>
-          <w:szCs w:val="24"/>
-        </w:rPr>
-      </w:pPr>
     </w:p>
     <w:p>
       <w:pPr>
@@ -522,23 +759,6 @@
           <w:szCs w:val="24"/>
         </w:rPr>
         <w:t>These updates include bug fixes, performance improvements, and adjustments aligned with the agreed-upon functionality.</w:t>
-      </w:r>
-    </w:p>
-    <w:p>
-      <w:pPr>
-        <w:rPr>
-          <w:rFonts w:ascii="Times New Roman" w:hAnsi="Times New Roman" w:cs="Times New Roman"/>
-          <w:sz w:val="24"/>
-          <w:szCs w:val="24"/>
-        </w:rPr>
-      </w:pPr>
-      <w:r>
-        <w:rPr>
-          <w:rFonts w:ascii="Times New Roman" w:hAnsi="Times New Roman" w:cs="Times New Roman"/>
-          <w:sz w:val="24"/>
-          <w:szCs w:val="24"/>
-        </w:rPr>
-        <w:br w:type="page"/>
       </w:r>
     </w:p>
     <w:p>

</xml_diff>